<commit_message>
Solucion de errroes en el word y optiomizacion y limpieza de codigo general
</commit_message>
<xml_diff>
--- a/src-electron/output_TemplateBautismo.docx
+++ b/src-electron/output_TemplateBautismo.docx
@@ -52,7 +52,7 @@
                 <w:b/>
                 <w:sz w:val="28"/>
               </w:rPr>
-              <w:t xml:space="preserve">MATIAS PALACIOS RODRÍGUEZ</w:t>
+              <w:t xml:space="preserve">DANNA SOFÍA DONCEL CUEVAS</w:t>
             </w:r>
           </w:p>
           <w:p>
@@ -71,7 +71,7 @@
                 <w:rFonts w:hAnsi="Arial"/>
                 <w:sz w:val="20"/>
               </w:rPr>
-              <w:t xml:space="preserve">4</w:t>
+              <w:t xml:space="preserve">2</w:t>
             </w:r>
             <w:r>
               <w:rPr>
@@ -85,7 +85,7 @@
                 <w:rFonts w:hAnsi="Arial"/>
                 <w:sz w:val="20"/>
               </w:rPr>
-              <w:t xml:space="preserve">181</w:t>
+              <w:t xml:space="preserve">184</w:t>
             </w:r>
             <w:r>
               <w:rPr>
@@ -99,7 +99,7 @@
                 <w:rFonts w:hAnsi="Arial"/>
                 <w:sz w:val="20"/>
               </w:rPr>
-              <w:t xml:space="preserve">362</w:t>
+              <w:t xml:space="preserve">367</w:t>
             </w:r>
           </w:p>
         </w:tc>
@@ -211,7 +211,7 @@
               <w:rPr>
                 <w:sz w:val="20"/>
               </w:rPr>
-              <w:t xml:space="preserve">2 DE JULIO DE 2017</w:t>
+              <w:t xml:space="preserve">12 DE MAYO DE 2013</w:t>
             </w:r>
             <w:proofErr w:type="spellStart"/>
             <w:r>
@@ -281,7 +281,7 @@
               <w:rPr>
                 <w:sz w:val="20"/>
               </w:rPr>
-              <w:t xml:space="preserve">LORENZO ÁLZATE ARBOLEDA. Pbro.</w:t>
+              <w:t xml:space="preserve">MARIO DE JESÚS ACOSTA RAMÍREZ. Pbro.</w:t>
             </w:r>
           </w:p>
         </w:tc>
@@ -337,7 +337,7 @@
               <w:rPr>
                 <w:sz w:val="20"/>
               </w:rPr>
-              <w:t xml:space="preserve">MATIAS PALACIOS RODRÍGUEZ</w:t>
+              <w:t xml:space="preserve">DANNA SOFÍA DONCEL CUEVAS</w:t>
             </w:r>
           </w:p>
         </w:tc>
@@ -463,7 +463,7 @@
               <w:rPr>
                 <w:sz w:val="20"/>
               </w:rPr>
-              <w:t xml:space="preserve">22 DE SEPTIEMBRE DE 2014</w:t>
+              <w:t xml:space="preserve">23 DE ABRIL DE 2012</w:t>
             </w:r>
             <w:proofErr w:type="spellStart"/>
             <w:r>
@@ -533,7 +533,7 @@
               <w:rPr>
                 <w:sz w:val="20"/>
               </w:rPr>
-              <w:t xml:space="preserve">CARLOS JULIO PALACIOS ROJAS Y LEIDY PAOLA RODRÍGUEZ BARON</w:t>
+              <w:t xml:space="preserve">FERNEY MAURICIO DONCEL RAMÍREZ Y SANDRA MILENA CUEVAS CÁRDENAS</w:t>
             </w:r>
           </w:p>
         </w:tc>
@@ -589,7 +589,7 @@
               <w:rPr>
                 <w:sz w:val="20"/>
               </w:rPr>
-              <w:t xml:space="preserve">LUIS RICARDO PALACIOS Y MARÍA FIDELINA ROJAS</w:t>
+              <w:t xml:space="preserve">EFRAIN DONCEL Y LEÓNOR RAMÍREZ</w:t>
             </w:r>
             <w:proofErr w:type="spellStart"/>
             <w:r>
@@ -659,7 +659,7 @@
               <w:rPr>
                 <w:sz w:val="20"/>
               </w:rPr>
-              <w:t xml:space="preserve">OBDULIO RODRÍGUEZ Y ROSALBA BARON</w:t>
+              <w:t xml:space="preserve">JOSÉ ADAN CUEVAS  Y ALIRA CÁRDENAS</w:t>
             </w:r>
             <w:proofErr w:type="spellStart"/>
             <w:r>
@@ -729,7 +729,7 @@
               <w:rPr>
                 <w:sz w:val="20"/>
               </w:rPr>
-              <w:t xml:space="preserve">LUIS RICARDO PALACIOS Y JANNETH PALACIOS</w:t>
+              <w:t xml:space="preserve">JIMMY EFRAIN DONCEL RAMÍREZ Y LUZ EDDY CUEVAS CÁRDENAS</w:t>
             </w:r>
           </w:p>
         </w:tc>
@@ -785,7 +785,7 @@
               <w:rPr>
                 <w:sz w:val="20"/>
               </w:rPr>
-              <w:t xml:space="preserve">LORENZO ÁLZATE ARBOLEDA.Pbro.</w:t>
+              <w:t xml:space="preserve">MARIO DE JESÚS ACOSTA RAMÍREZ.Pbro.</w:t>
             </w:r>
             <w:proofErr w:type="spellStart"/>
             <w:r>
@@ -906,7 +906,7 @@
                 <w:color w:val="000000"/>
                 <w:sz w:val="20"/>
               </w:rPr>
-              <w:t xml:space="preserve">Expedida en: Bogotá, Cundinamarca el Domingo 31 de Diciembre de 2023</w:t>
+              <w:t xml:space="preserve">Expedida en: Bogotá, Cundinamarca el Viernes 19 de Enero de 2024</w:t>
             </w:r>
             <w:proofErr w:type="spellStart"/>
             <w:r>
@@ -1015,7 +1015,7 @@
               <w:rPr>
                 <w:sz w:val="20"/>
               </w:rPr>
-              <w:t/>
+              <w:t xml:space="preserve">YOEL GÓMEZ RAMÍREZ. Pbro.</w:t>
             </w:r>
           </w:p>
           <w:p>
@@ -1032,7 +1032,7 @@
               <w:rPr>
                 <w:sz w:val="20"/>
               </w:rPr>
-              <w:t/>
+              <w:t xml:space="preserve">Párroco</w:t>
             </w:r>
             <w:r>
               <w:rPr>

</xml_diff>

<commit_message>
adding new changes in config
</commit_message>
<xml_diff>
--- a/src-electron/output_TemplateBautismo.docx
+++ b/src-electron/output_TemplateBautismo.docx
@@ -52,7 +52,7 @@
                 <w:b/>
                 <w:sz w:val="28"/>
               </w:rPr>
-              <w:t xml:space="preserve">YOEL SANTIAGO ÁVILA VIRGUEZz</w:t>
+              <w:t xml:space="preserve">OMAR RICARDO MUÑOZ ALDANA</w:t>
             </w:r>
           </w:p>
           <w:p>
@@ -71,7 +71,7 @@
                 <w:rFonts w:hAnsi="Arial"/>
                 <w:sz w:val="20"/>
               </w:rPr>
-              <w:t xml:space="preserve">3</w:t>
+              <w:t xml:space="preserve">1</w:t>
             </w:r>
             <w:r>
               <w:rPr>
@@ -85,7 +85,7 @@
                 <w:rFonts w:hAnsi="Arial"/>
                 <w:sz w:val="20"/>
               </w:rPr>
-              <w:t xml:space="preserve">181</w:t>
+              <w:t xml:space="preserve">100</w:t>
             </w:r>
             <w:r>
               <w:rPr>
@@ -99,7 +99,7 @@
                 <w:rFonts w:hAnsi="Arial"/>
                 <w:sz w:val="20"/>
               </w:rPr>
-              <w:t xml:space="preserve">362</w:t>
+              <w:t xml:space="preserve">199</w:t>
             </w:r>
           </w:p>
         </w:tc>
@@ -211,7 +211,7 @@
               <w:rPr>
                 <w:sz w:val="20"/>
               </w:rPr>
-              <w:t xml:space="preserve">18 DE JULIO DE 2015</w:t>
+              <w:t xml:space="preserve">24 DE JUNIO DE 1990</w:t>
             </w:r>
           </w:p>
         </w:tc>
@@ -267,7 +267,7 @@
               <w:rPr>
                 <w:sz w:val="20"/>
               </w:rPr>
-              <w:t xml:space="preserve">LORENZO ALZATE ARBOLEDA. Pbro</w:t>
+              <w:t xml:space="preserve">LUIS HERNANDO RÍOS ALDANA. PBRO.</w:t>
             </w:r>
           </w:p>
         </w:tc>
@@ -323,7 +323,7 @@
               <w:rPr>
                 <w:sz w:val="20"/>
               </w:rPr>
-              <w:t xml:space="preserve">YOEL SANTIAGO ÁVILA VIRGUEZz</w:t>
+              <w:t xml:space="preserve">OMAR RICARDO MUÑOZ ALDANA</w:t>
             </w:r>
           </w:p>
         </w:tc>
@@ -435,7 +435,7 @@
               <w:rPr>
                 <w:sz w:val="20"/>
               </w:rPr>
-              <w:t xml:space="preserve">08 DE JULIO DE 2012</w:t>
+              <w:t xml:space="preserve">09 DE ENERO DE 1985</w:t>
             </w:r>
           </w:p>
         </w:tc>
@@ -491,7 +491,7 @@
               <w:rPr>
                 <w:sz w:val="20"/>
               </w:rPr>
-              <w:t xml:space="preserve">EDGAR ÁVILA GUERRA Y LEIDY DAMAREZ VIRGUEZ  GUINEA</w:t>
+              <w:t xml:space="preserve">RICARDO MUÑOZ Y DORIS BENICIA ALDANA</w:t>
             </w:r>
           </w:p>
         </w:tc>
@@ -547,7 +547,7 @@
               <w:rPr>
                 <w:sz w:val="20"/>
               </w:rPr>
-              <w:t xml:space="preserve">JAIME ÁVILA Y STEFANIA GUERRA</w:t>
+              <w:t xml:space="preserve">ALFONSO MUÑOZ Y EMMA RIAÑO</w:t>
             </w:r>
           </w:p>
         </w:tc>
@@ -603,16 +603,7 @@
               <w:rPr>
                 <w:sz w:val="20"/>
               </w:rPr>
-              <w:t xml:space="preserve">ALCIDES VIRGUEZ Y DORA </w:t>
-            </w:r>
-            <w:r>
-              <w:br/>
-            </w:r>
-            <w:r>
-              <w:rPr>
-                <w:sz w:val="20"/>
-              </w:rPr>
-              <w:t xml:space="preserve">ALCIDES VIRGUEZ  Y DORA INÉS GUINEA</w:t>
+              <w:t xml:space="preserve">PEDRO ANTONIO ALDANA Y BEATRIZ VANEGAS</w:t>
             </w:r>
           </w:p>
         </w:tc>
@@ -668,7 +659,7 @@
               <w:rPr>
                 <w:sz w:val="20"/>
               </w:rPr>
-              <w:t xml:space="preserve">CRISTIAN CAMILO BOHÓRQUEZ Y DIANA JIMENA ALONSO</w:t>
+              <w:t xml:space="preserve">HÉCTOR HERNANDO SÁNCHEZ Y LUZ MARINA JIMÉNEZ</w:t>
             </w:r>
           </w:p>
         </w:tc>
@@ -724,7 +715,7 @@
               <w:rPr>
                 <w:sz w:val="20"/>
               </w:rPr>
-              <w:t xml:space="preserve">LORENZO ÁLZATE ARBOLEDA.Pbro.</w:t>
+              <w:t xml:space="preserve">LUIS HERNANDO RÍOS ALDANA PBRO.</w:t>
             </w:r>
           </w:p>
         </w:tc>
@@ -780,7 +771,7 @@
               <w:rPr>
                 <w:sz w:val="20"/>
               </w:rPr>
-              <w:t xml:space="preserve">SIN NOTAS MARGINALES HASTA LA FECHA</w:t>
+              <w:t/>
             </w:r>
           </w:p>
         </w:tc>
@@ -817,7 +808,7 @@
                 <w:color w:val="000000"/>
                 <w:sz w:val="20"/>
               </w:rPr>
-              <w:t xml:space="preserve">Expedida en: Bogotá, Cundinamarca el Viernes 19 de Enero de 2024</w:t>
+              <w:t xml:space="preserve">Expedida en: Bogotá, Cundinamarca el Lunes 6 de Abril de 2026</w:t>
             </w:r>
             <w:r>
               <w:rPr>
@@ -924,7 +915,7 @@
               <w:rPr>
                 <w:sz w:val="20"/>
               </w:rPr>
-              <w:t xml:space="preserve">YOEL GÓMEZ RAMÍREZ. Pbro.</w:t>
+              <w:t xml:space="preserve">LUIS HERNANDO RÍOS ALDANA PBRO.</w:t>
             </w:r>
           </w:p>
           <w:p>
@@ -1033,7 +1024,7 @@
       <w:rPr>
         <w:rFonts w:hAnsi="Arial"/>
       </w:rPr>
-      <w:t>9</w:t>
+      <w:t>8</w:t>
     </w:r>
     <w:r>
       <w:rPr>

</xml_diff>